<commit_message>
Actualización mensual de métricas de crecimiento (Mayo 2026)
</commit_message>
<xml_diff>
--- a/Resultados Generales Carreras Profesionales MAY26ob.docx
+++ b/Resultados Generales Carreras Profesionales MAY26ob.docx
@@ -17708,6 +17708,15 @@
                 <w:szCs w:val="16"/>
               </w:rPr>
             </w:pPr>
+            <w:r>
+              <w:rPr>
+                <w:rFonts w:ascii="Arial" w:eastAsia="Arial" w:hAnsi="Arial" w:cs="Arial"/>
+                <w:color w:val="000000"/>
+                <w:sz w:val="16"/>
+                <w:szCs w:val="16"/>
+              </w:rPr>
+              <w:t>10</w:t>
+            </w:r>
           </w:p>
         </w:tc>
         <w:tc>
@@ -18137,6 +18146,15 @@
                 <w:szCs w:val="16"/>
               </w:rPr>
             </w:pPr>
+            <w:r>
+              <w:rPr>
+                <w:rFonts w:ascii="Arial" w:eastAsia="Arial" w:hAnsi="Arial" w:cs="Arial"/>
+                <w:color w:val="000000"/>
+                <w:sz w:val="16"/>
+                <w:szCs w:val="16"/>
+              </w:rPr>
+              <w:t>3</w:t>
+            </w:r>
           </w:p>
         </w:tc>
         <w:tc>
@@ -18566,6 +18584,15 @@
                 <w:szCs w:val="16"/>
               </w:rPr>
             </w:pPr>
+            <w:r>
+              <w:rPr>
+                <w:rFonts w:ascii="Arial" w:eastAsia="Arial" w:hAnsi="Arial" w:cs="Arial"/>
+                <w:color w:val="000000"/>
+                <w:sz w:val="16"/>
+                <w:szCs w:val="16"/>
+              </w:rPr>
+              <w:t>1</w:t>
+            </w:r>
           </w:p>
         </w:tc>
         <w:tc>
@@ -18991,6 +19018,15 @@
                 <w:szCs w:val="16"/>
               </w:rPr>
             </w:pPr>
+            <w:r>
+              <w:rPr>
+                <w:rFonts w:ascii="Arial" w:eastAsia="Arial" w:hAnsi="Arial" w:cs="Arial"/>
+                <w:color w:val="000000"/>
+                <w:sz w:val="16"/>
+                <w:szCs w:val="16"/>
+              </w:rPr>
+              <w:t>14</w:t>
+            </w:r>
           </w:p>
         </w:tc>
         <w:tc>
@@ -19406,6 +19442,15 @@
                 <w:szCs w:val="16"/>
               </w:rPr>
             </w:pPr>
+            <w:r>
+              <w:rPr>
+                <w:rFonts w:ascii="Arial" w:eastAsia="Arial" w:hAnsi="Arial" w:cs="Arial"/>
+                <w:color w:val="000000"/>
+                <w:sz w:val="16"/>
+                <w:szCs w:val="16"/>
+              </w:rPr>
+              <w:t>1</w:t>
+            </w:r>
           </w:p>
         </w:tc>
         <w:tc>
@@ -19427,18 +19472,16 @@
                 <w:color w:val="000000"/>
                 <w:sz w:val="16"/>
                 <w:szCs w:val="16"/>
-                <w:highlight w:val="yellow"/>
-              </w:rPr>
-            </w:pPr>
-            <w:r>
-              <w:rPr>
-                <w:rFonts w:ascii="Arial" w:eastAsia="Arial" w:hAnsi="Arial" w:cs="Arial"/>
-                <w:color w:val="000000"/>
-                <w:sz w:val="16"/>
-                <w:szCs w:val="16"/>
-                <w:highlight w:val="yellow"/>
-              </w:rPr>
-              <w:t>p</w:t>
+              </w:rPr>
+            </w:pPr>
+            <w:r>
+              <w:rPr>
+                <w:rFonts w:ascii="Arial" w:eastAsia="Arial" w:hAnsi="Arial" w:cs="Arial"/>
+                <w:color w:val="000000"/>
+                <w:sz w:val="16"/>
+                <w:szCs w:val="16"/>
+              </w:rPr>
+              <w:t>25</w:t>
             </w:r>
           </w:p>
         </w:tc>
@@ -19819,6 +19862,15 @@
                 <w:szCs w:val="16"/>
               </w:rPr>
             </w:pPr>
+            <w:r>
+              <w:rPr>
+                <w:rFonts w:ascii="Arial" w:eastAsia="Arial" w:hAnsi="Arial" w:cs="Arial"/>
+                <w:color w:val="000000"/>
+                <w:sz w:val="16"/>
+                <w:szCs w:val="16"/>
+              </w:rPr>
+              <w:t>0</w:t>
+            </w:r>
           </w:p>
         </w:tc>
         <w:tc>
@@ -19834,24 +19886,21 @@
           <w:p>
             <w:pPr>
               <w:spacing w:after="0" w:line="240" w:lineRule="auto"/>
-              <w:jc w:val="center"/>
-              <w:rPr>
-                <w:rFonts w:ascii="Arial" w:eastAsia="Arial" w:hAnsi="Arial" w:cs="Arial"/>
-                <w:color w:val="000000"/>
-                <w:sz w:val="16"/>
-                <w:szCs w:val="16"/>
-                <w:highlight w:val="yellow"/>
-              </w:rPr>
-            </w:pPr>
-            <w:r>
-              <w:rPr>
-                <w:rFonts w:ascii="Arial" w:eastAsia="Arial" w:hAnsi="Arial" w:cs="Arial"/>
-                <w:color w:val="000000"/>
-                <w:sz w:val="16"/>
-                <w:szCs w:val="16"/>
-                <w:highlight w:val="yellow"/>
-              </w:rPr>
-              <w:t>p</w:t>
+              <w:rPr>
+                <w:rFonts w:ascii="Arial" w:eastAsia="Arial" w:hAnsi="Arial" w:cs="Arial"/>
+                <w:color w:val="000000"/>
+                <w:sz w:val="16"/>
+                <w:szCs w:val="16"/>
+              </w:rPr>
+            </w:pPr>
+            <w:r>
+              <w:rPr>
+                <w:rFonts w:ascii="Arial" w:eastAsia="Arial" w:hAnsi="Arial" w:cs="Arial"/>
+                <w:color w:val="000000"/>
+                <w:sz w:val="16"/>
+                <w:szCs w:val="16"/>
+              </w:rPr>
+              <w:t xml:space="preserve">        3</w:t>
             </w:r>
           </w:p>
         </w:tc>
@@ -20232,6 +20281,15 @@
                 <w:szCs w:val="16"/>
               </w:rPr>
             </w:pPr>
+            <w:r>
+              <w:rPr>
+                <w:rFonts w:ascii="Arial" w:eastAsia="Arial" w:hAnsi="Arial" w:cs="Arial"/>
+                <w:color w:val="000000"/>
+                <w:sz w:val="16"/>
+                <w:szCs w:val="16"/>
+              </w:rPr>
+              <w:t>0</w:t>
+            </w:r>
           </w:p>
         </w:tc>
         <w:tc>
@@ -20253,18 +20311,16 @@
                 <w:color w:val="000000"/>
                 <w:sz w:val="16"/>
                 <w:szCs w:val="16"/>
-                <w:highlight w:val="yellow"/>
-              </w:rPr>
-            </w:pPr>
-            <w:r>
-              <w:rPr>
-                <w:rFonts w:ascii="Arial" w:eastAsia="Arial" w:hAnsi="Arial" w:cs="Arial"/>
-                <w:color w:val="000000"/>
-                <w:sz w:val="16"/>
-                <w:szCs w:val="16"/>
-                <w:highlight w:val="yellow"/>
-              </w:rPr>
-              <w:t>p</w:t>
+              </w:rPr>
+            </w:pPr>
+            <w:r>
+              <w:rPr>
+                <w:rFonts w:ascii="Arial" w:eastAsia="Arial" w:hAnsi="Arial" w:cs="Arial"/>
+                <w:color w:val="000000"/>
+                <w:sz w:val="16"/>
+                <w:szCs w:val="16"/>
+              </w:rPr>
+              <w:t>1</w:t>
             </w:r>
           </w:p>
         </w:tc>
@@ -20657,6 +20713,15 @@
                 <w:szCs w:val="16"/>
               </w:rPr>
             </w:pPr>
+            <w:r>
+              <w:rPr>
+                <w:rFonts w:ascii="Arial" w:eastAsia="Arial" w:hAnsi="Arial" w:cs="Arial"/>
+                <w:color w:val="000000"/>
+                <w:sz w:val="16"/>
+                <w:szCs w:val="16"/>
+              </w:rPr>
+              <w:t>0</w:t>
+            </w:r>
           </w:p>
         </w:tc>
         <w:tc>
@@ -20678,18 +20743,16 @@
                 <w:color w:val="000000"/>
                 <w:sz w:val="16"/>
                 <w:szCs w:val="16"/>
-                <w:highlight w:val="yellow"/>
-              </w:rPr>
-            </w:pPr>
-            <w:r>
-              <w:rPr>
-                <w:rFonts w:ascii="Arial" w:eastAsia="Arial" w:hAnsi="Arial" w:cs="Arial"/>
-                <w:color w:val="000000"/>
-                <w:sz w:val="16"/>
-                <w:szCs w:val="16"/>
-                <w:highlight w:val="yellow"/>
-              </w:rPr>
-              <w:t>p</w:t>
+              </w:rPr>
+            </w:pPr>
+            <w:r>
+              <w:rPr>
+                <w:rFonts w:ascii="Arial" w:eastAsia="Arial" w:hAnsi="Arial" w:cs="Arial"/>
+                <w:color w:val="000000"/>
+                <w:sz w:val="16"/>
+                <w:szCs w:val="16"/>
+              </w:rPr>
+              <w:t>1</w:t>
             </w:r>
           </w:p>
         </w:tc>
@@ -21061,6 +21124,15 @@
                 <w:szCs w:val="16"/>
               </w:rPr>
             </w:pPr>
+            <w:r>
+              <w:rPr>
+                <w:rFonts w:ascii="Arial" w:eastAsia="Arial" w:hAnsi="Arial" w:cs="Arial"/>
+                <w:color w:val="000000"/>
+                <w:sz w:val="16"/>
+                <w:szCs w:val="16"/>
+              </w:rPr>
+              <w:t>0</w:t>
+            </w:r>
           </w:p>
         </w:tc>
         <w:tc>
@@ -21082,18 +21154,16 @@
                 <w:color w:val="000000"/>
                 <w:sz w:val="16"/>
                 <w:szCs w:val="16"/>
-                <w:highlight w:val="yellow"/>
-              </w:rPr>
-            </w:pPr>
-            <w:r>
-              <w:rPr>
-                <w:rFonts w:ascii="Arial" w:eastAsia="Arial" w:hAnsi="Arial" w:cs="Arial"/>
-                <w:color w:val="000000"/>
-                <w:sz w:val="16"/>
-                <w:szCs w:val="16"/>
-                <w:highlight w:val="yellow"/>
-              </w:rPr>
-              <w:t>p</w:t>
+              </w:rPr>
+            </w:pPr>
+            <w:r>
+              <w:rPr>
+                <w:rFonts w:ascii="Arial" w:eastAsia="Arial" w:hAnsi="Arial" w:cs="Arial"/>
+                <w:color w:val="000000"/>
+                <w:sz w:val="16"/>
+                <w:szCs w:val="16"/>
+              </w:rPr>
+              <w:t>0</w:t>
             </w:r>
           </w:p>
         </w:tc>
@@ -21479,6 +21549,15 @@
                 <w:szCs w:val="16"/>
               </w:rPr>
             </w:pPr>
+            <w:r>
+              <w:rPr>
+                <w:rFonts w:ascii="Arial" w:eastAsia="Arial" w:hAnsi="Arial" w:cs="Arial"/>
+                <w:color w:val="000000"/>
+                <w:sz w:val="16"/>
+                <w:szCs w:val="16"/>
+              </w:rPr>
+              <w:t>1</w:t>
+            </w:r>
           </w:p>
         </w:tc>
         <w:tc>
@@ -21501,19 +21580,19 @@
                 <w:color w:val="000000"/>
                 <w:sz w:val="16"/>
                 <w:szCs w:val="16"/>
-                <w:highlight w:val="yellow"/>
-              </w:rPr>
-            </w:pPr>
-            <w:r>
-              <w:rPr>
-                <w:rFonts w:ascii="Arial" w:eastAsia="Arial" w:hAnsi="Arial" w:cs="Arial"/>
-                <w:color w:val="000000"/>
-                <w:sz w:val="16"/>
-                <w:szCs w:val="16"/>
-                <w:highlight w:val="yellow"/>
-              </w:rPr>
-              <w:t>p</w:t>
-            </w:r>
+              </w:rPr>
+            </w:pPr>
+            <w:r>
+              <w:rPr>
+                <w:rFonts w:ascii="Arial" w:eastAsia="Arial" w:hAnsi="Arial" w:cs="Arial"/>
+                <w:color w:val="000000"/>
+                <w:sz w:val="16"/>
+                <w:szCs w:val="16"/>
+              </w:rPr>
+              <w:t>30</w:t>
+            </w:r>
+            <w:bookmarkStart w:id="0" w:name="_GoBack"/>
+            <w:bookmarkEnd w:id="0"/>
           </w:p>
         </w:tc>
         <w:tc>
@@ -21898,6 +21977,15 @@
                 <w:szCs w:val="16"/>
               </w:rPr>
             </w:pPr>
+            <w:r>
+              <w:rPr>
+                <w:rFonts w:ascii="Arial" w:eastAsia="Arial" w:hAnsi="Arial" w:cs="Arial"/>
+                <w:color w:val="000000"/>
+                <w:sz w:val="16"/>
+                <w:szCs w:val="16"/>
+              </w:rPr>
+              <w:t>15</w:t>
+            </w:r>
           </w:p>
         </w:tc>
         <w:tc>
@@ -21920,18 +22008,16 @@
                 <w:color w:val="000000"/>
                 <w:sz w:val="16"/>
                 <w:szCs w:val="16"/>
-                <w:highlight w:val="yellow"/>
-              </w:rPr>
-            </w:pPr>
-            <w:r>
-              <w:rPr>
-                <w:rFonts w:ascii="Arial" w:eastAsia="Arial" w:hAnsi="Arial" w:cs="Arial"/>
-                <w:color w:val="000000"/>
-                <w:sz w:val="16"/>
-                <w:szCs w:val="16"/>
-                <w:highlight w:val="yellow"/>
-              </w:rPr>
-              <w:t>p</w:t>
+              </w:rPr>
+            </w:pPr>
+            <w:r>
+              <w:rPr>
+                <w:rFonts w:ascii="Arial" w:eastAsia="Arial" w:hAnsi="Arial" w:cs="Arial"/>
+                <w:color w:val="000000"/>
+                <w:sz w:val="16"/>
+                <w:szCs w:val="16"/>
+              </w:rPr>
+              <w:t>178</w:t>
             </w:r>
           </w:p>
         </w:tc>
@@ -22144,8 +22230,6 @@
               </w:rPr>
               <w:t>19</w:t>
             </w:r>
-            <w:bookmarkStart w:id="0" w:name="_GoBack"/>
-            <w:bookmarkEnd w:id="0"/>
           </w:p>
         </w:tc>
         <w:tc>
@@ -29857,7 +29941,7 @@
 </file>
 
 <file path=customXml/itemProps2.xml><?xml version="1.0" encoding="utf-8"?>
-<ds:datastoreItem xmlns:ds="http://schemas.openxmlformats.org/officeDocument/2006/customXml" ds:itemID="{0B3B6D92-52AB-449C-B572-46031375BB84}">
+<ds:datastoreItem xmlns:ds="http://schemas.openxmlformats.org/officeDocument/2006/customXml" ds:itemID="{2F81485D-2D4D-4928-9FFE-E423A829090B}">
   <ds:schemaRefs>
     <ds:schemaRef ds:uri="http://schemas.openxmlformats.org/officeDocument/2006/bibliography"/>
   </ds:schemaRefs>

</xml_diff>